<commit_message>
Match residential notice spacing in Word Online and PDF
</commit_message>
<xml_diff>
--- a/templates/residential-pay-or-quit-2026-10.docx
+++ b/templates/residential-pay-or-quit-2026-10.docx
@@ -5,7 +5,7 @@
     <w:p>
       <w:pPr>
         <w:pStyle w:val="BodyText"/>
-        <w:spacing w:before="0" w:after="0" w:line="1" w:lineRule="exact"/>
+        <w:spacing w:before="0" w:after="0" w:line="1964" w:lineRule="exact"/>
         <w:rPr>
           <w:sz w:val="31"/>
         </w:rPr>
@@ -162,43 +162,52 @@
     <w:p>
       <w:pPr>
         <w:keepNext w:val="0"/>
-        <w:spacing w:before="0" w:after="0" w:line="1999" w:lineRule="exact"/>
-      </w:pPr>
-      <w:r>
-        <w:rPr>
-          <w:sz w:val="1"/>
-        </w:rPr>
-      </w:r>
-    </w:p>
-    <w:p>
-      <w:pPr>
-        <w:keepNext w:val="0"/>
         <w:keepLines/>
         <w:widowControl w:val="0"/>
         <w:spacing w:before="0" w:after="0" w:line="400" w:lineRule="exact"/>
+        <w:ind w:left="286" w:right="914" w:firstLine="0"/>
+        <w:jc w:val="center"/>
+      </w:pPr>
+      <w:r>
+        <w:rPr>
+          <w:rFonts w:ascii="Times New Roman" w:hAnsi="Times New Roman"/>
+          <w:b/>
+          <w:color w:val="000000"/>
+          <w:sz w:val="31"/>
+          <w:u w:val="none"/>
+        </w:rPr>
+        <w:t>THREE (3) DAY NOTICE TO PAY OR QUIT</w:t>
+      </w:r>
+    </w:p>
+    <w:p>
+      <w:pPr>
+        <w:keepNext w:val="0"/>
+        <w:keepLines/>
+        <w:widowControl w:val="0"/>
+        <w:spacing w:before="236" w:after="0" w:line="280" w:lineRule="exact"/>
         <w:ind w:left="360" w:right="840" w:firstLine="0"/>
-        <w:jc w:val="center"/>
-      </w:pPr>
-      <w:r>
-        <w:rPr>
-          <w:rFonts w:ascii="Times New Roman" w:hAnsi="Times New Roman"/>
-          <w:b/>
-          <w:color w:val="000000"/>
-          <w:sz w:val="32"/>
-          <w:u w:val="none"/>
-        </w:rPr>
-        <w:t>THREE (3) DAY NOTICE TO PAY OR QUIT</w:t>
-      </w:r>
-    </w:p>
-    <w:p>
-      <w:pPr>
-        <w:keepNext w:val="0"/>
-        <w:spacing w:before="0" w:after="0" w:line="200" w:lineRule="exact"/>
-      </w:pPr>
-      <w:r>
-        <w:rPr>
-          <w:sz w:val="1"/>
-        </w:rPr>
+        <w:jc w:val="left"/>
+      </w:pPr>
+      <w:bookmarkStart w:id="3" w:name="BE_TENANT_NAMES"/>
+      <w:r>
+        <w:rPr>
+          <w:rFonts w:ascii="Times New Roman" w:hAnsi="Times New Roman"/>
+          <w:b w:val="0"/>
+          <w:color w:val="000000"/>
+          <w:sz w:val="23"/>
+          <w:u w:val="none"/>
+        </w:rPr>
+        <w:t xml:space="preserve">To: </w:t>
+      </w:r>
+      <w:bookmarkEnd w:id="3"/>
+      <w:r>
+        <w:rPr>
+          <w:rFonts w:ascii="Times New Roman" w:hAnsi="Times New Roman"/>
+          <w:sz w:val="24"/>
+        </w:rPr>
+        <w:t>{{TENANT_NAMES}}</w:t>
+        <w:br/>
+        <w:t>{{TENANT_NAMES_CONTINUED}}</w:t>
       </w:r>
     </w:p>
     <w:p>
@@ -210,51 +219,40 @@
         <w:ind w:left="360" w:right="840" w:firstLine="0"/>
         <w:jc w:val="left"/>
       </w:pPr>
-      <w:bookmarkStart w:id="5" w:name="BE_TENANT_NAMES"/>
-      <w:r>
-        <w:rPr>
-          <w:rFonts w:ascii="Times New Roman" w:hAnsi="Times New Roman"/>
-          <w:b w:val="0"/>
-          <w:color w:val="000000"/>
+      <w:r>
+        <w:rPr>
+          <w:rFonts w:ascii="Times New Roman" w:hAnsi="Times New Roman"/>
+          <w:b w:val="0"/>
+          <w:color w:val="000000"/>
+          <w:position w:val="2"/>
+          <w:sz w:val="23"/>
+          <w:u w:val="none"/>
+        </w:rPr>
+        <w:t>Tenants in possession of the premises herein referred to are situated at:</w:t>
+      </w:r>
+    </w:p>
+    <w:p>
+      <w:pPr>
+        <w:keepNext w:val="0"/>
+        <w:keepLines/>
+        <w:widowControl w:val="0"/>
+        <w:spacing w:before="160" w:after="0" w:line="280" w:lineRule="exact"/>
+        <w:ind w:left="1040" w:right="860" w:firstLine="0"/>
+        <w:jc w:val="left"/>
+      </w:pPr>
+      <w:bookmarkStart w:id="5" w:name="BE_PROPERTY_STREET"/>
+      <w:r>
+        <w:rPr>
+          <w:rFonts w:ascii="Times New Roman" w:hAnsi="Times New Roman"/>
+          <w:b w:val="0"/>
+          <w:color w:val="000000"/>
+          <w:position w:val="2"/>
           <w:sz w:val="24"/>
           <w:u w:val="none"/>
         </w:rPr>
-        <w:t>To: {{TENANT_NAMES}}</w:t>
-        <w:br/>
-        <w:t>{{TENANT_NAMES_CONTINUED}}</w:t>
+        <w:t>{{PROPERTY_STREET}}</w:t>
       </w:r>
       <w:bookmarkEnd w:id="5"/>
-    </w:p>
-    <w:p>
-      <w:pPr>
-        <w:keepNext w:val="0"/>
-        <w:keepLines/>
-        <w:widowControl w:val="0"/>
-        <w:spacing w:before="0" w:after="0" w:line="280" w:lineRule="exact"/>
-        <w:ind w:left="360" w:right="840" w:firstLine="0"/>
-        <w:jc w:val="left"/>
-      </w:pPr>
-      <w:r>
-        <w:rPr>
-          <w:rFonts w:ascii="Times New Roman" w:hAnsi="Times New Roman"/>
-          <w:b w:val="0"/>
-          <w:color w:val="000000"/>
-          <w:sz w:val="23"/>
-          <w:u w:val="none"/>
-        </w:rPr>
-        <w:t>Tenants in possession of the premises herein referred to are situated at:</w:t>
-      </w:r>
-    </w:p>
-    <w:p>
-      <w:pPr>
-        <w:keepNext w:val="0"/>
-        <w:spacing w:before="0" w:after="0" w:line="160" w:lineRule="exact"/>
-      </w:pPr>
-      <w:r>
-        <w:rPr>
-          <w:sz w:val="1"/>
-        </w:rPr>
-      </w:r>
     </w:p>
     <w:p>
       <w:pPr>
@@ -265,7 +263,7 @@
         <w:ind w:left="1040" w:right="860" w:firstLine="0"/>
         <w:jc w:val="left"/>
       </w:pPr>
-      <w:bookmarkStart w:id="8" w:name="BE_PROPERTY_STREET"/>
+      <w:bookmarkStart w:id="6" w:name="BE_PROPERTY_CITY"/>
       <w:r>
         <w:rPr>
           <w:rFonts w:ascii="Times New Roman" w:hAnsi="Times New Roman"/>
@@ -274,82 +272,47 @@
           <w:sz w:val="24"/>
           <w:u w:val="none"/>
         </w:rPr>
-        <w:t>{{PROPERTY_STREET}}</w:t>
-      </w:r>
-      <w:bookmarkEnd w:id="8"/>
-    </w:p>
-    <w:p>
-      <w:pPr>
-        <w:keepNext w:val="0"/>
-        <w:keepLines/>
-        <w:widowControl w:val="0"/>
-        <w:spacing w:before="0" w:after="0" w:line="280" w:lineRule="exact"/>
-        <w:ind w:left="1040" w:right="860" w:firstLine="0"/>
-        <w:jc w:val="left"/>
-      </w:pPr>
-      <w:bookmarkStart w:id="9" w:name="BE_PROPERTY_CITY"/>
-      <w:r>
-        <w:rPr>
-          <w:rFonts w:ascii="Times New Roman" w:hAnsi="Times New Roman"/>
-          <w:b w:val="0"/>
-          <w:color w:val="000000"/>
+        <w:t>{{PROPERTY_CITY}}</w:t>
+      </w:r>
+      <w:bookmarkEnd w:id="6"/>
+    </w:p>
+    <w:p>
+      <w:pPr>
+        <w:keepNext w:val="0"/>
+        <w:keepLines/>
+        <w:widowControl w:val="0"/>
+        <w:spacing w:before="80" w:after="0" w:line="280" w:lineRule="exact"/>
+        <w:ind w:left="1080" w:right="820" w:firstLine="0"/>
+        <w:jc w:val="left"/>
+      </w:pPr>
+      <w:bookmarkStart w:id="7" w:name="BE_COUNTY"/>
+      <w:r>
+        <w:rPr>
+          <w:rFonts w:ascii="Times New Roman" w:hAnsi="Times New Roman"/>
+          <w:b w:val="0"/>
+          <w:color w:val="000000"/>
+          <w:position w:val="-1"/>
+          <w:sz w:val="23"/>
+          <w:u w:val="none"/>
+        </w:rPr>
+        <w:t xml:space="preserve">COUNTY OF </w:t>
+      </w:r>
+      <w:bookmarkEnd w:id="7"/>
+      <w:r>
+        <w:rPr>
+          <w:rFonts w:ascii="Times New Roman" w:hAnsi="Times New Roman"/>
+          <w:position w:val="-1"/>
           <w:sz w:val="24"/>
-          <w:u w:val="none"/>
-        </w:rPr>
-        <w:t>{{PROPERTY_CITY}}</w:t>
-      </w:r>
-      <w:bookmarkEnd w:id="9"/>
-    </w:p>
-    <w:p>
-      <w:pPr>
-        <w:keepNext w:val="0"/>
-        <w:spacing w:before="0" w:after="0" w:line="80" w:lineRule="exact"/>
-      </w:pPr>
-      <w:r>
-        <w:rPr>
-          <w:sz w:val="1"/>
-        </w:rPr>
-      </w:r>
-    </w:p>
-    <w:p>
-      <w:pPr>
-        <w:keepNext w:val="0"/>
-        <w:keepLines/>
-        <w:widowControl w:val="0"/>
-        <w:spacing w:before="0" w:after="0" w:line="280" w:lineRule="exact"/>
-        <w:ind w:left="1080" w:right="820" w:firstLine="0"/>
-        <w:jc w:val="left"/>
-      </w:pPr>
-      <w:bookmarkStart w:id="11" w:name="BE_COUNTY"/>
-      <w:r>
-        <w:rPr>
-          <w:rFonts w:ascii="Times New Roman" w:hAnsi="Times New Roman"/>
-          <w:b w:val="0"/>
-          <w:color w:val="000000"/>
-          <w:sz w:val="24"/>
-          <w:u w:val="none"/>
-        </w:rPr>
-        <w:t>COUNTY OF {{COUNTY}}</w:t>
-      </w:r>
-      <w:bookmarkEnd w:id="11"/>
-    </w:p>
-    <w:p>
-      <w:pPr>
-        <w:keepNext w:val="0"/>
-        <w:spacing w:before="0" w:after="0" w:line="20" w:lineRule="exact"/>
-      </w:pPr>
-      <w:r>
-        <w:rPr>
-          <w:sz w:val="1"/>
-        </w:rPr>
-      </w:r>
-    </w:p>
-    <w:p>
-      <w:pPr>
-        <w:keepNext w:val="0"/>
-        <w:keepLines/>
-        <w:widowControl w:val="0"/>
-        <w:spacing w:before="0" w:after="0" w:line="280" w:lineRule="exact"/>
+        </w:rPr>
+        <w:t>{{COUNTY}}</w:t>
+      </w:r>
+    </w:p>
+    <w:p>
+      <w:pPr>
+        <w:keepNext w:val="0"/>
+        <w:keepLines/>
+        <w:widowControl w:val="0"/>
+        <w:spacing w:before="20" w:after="0" w:line="280" w:lineRule="exact"/>
         <w:ind w:left="360" w:right="840" w:firstLine="0"/>
         <w:jc w:val="left"/>
       </w:pPr>
@@ -358,6 +321,7 @@
           <w:rFonts w:ascii="Times New Roman" w:hAnsi="Times New Roman"/>
           <w:b w:val="0"/>
           <w:color w:val="000000"/>
+          <w:position w:val="1"/>
           <w:sz w:val="23"/>
           <w:u w:val="none"/>
         </w:rPr>
@@ -367,20 +331,9 @@
     <w:p>
       <w:pPr>
         <w:keepNext w:val="0"/>
-        <w:spacing w:before="0" w:after="0" w:line="260" w:lineRule="exact"/>
-      </w:pPr>
-      <w:r>
-        <w:rPr>
-          <w:sz w:val="1"/>
-        </w:rPr>
-      </w:r>
-    </w:p>
-    <w:p>
-      <w:pPr>
-        <w:keepNext w:val="0"/>
-        <w:keepLines/>
-        <w:widowControl w:val="0"/>
-        <w:spacing w:before="0" w:after="0" w:line="316" w:lineRule="exact"/>
+        <w:keepLines/>
+        <w:widowControl w:val="0"/>
+        <w:spacing w:before="260" w:after="0" w:line="316" w:lineRule="exact"/>
         <w:ind w:left="360" w:right="840" w:firstLine="0"/>
         <w:jc w:val="left"/>
       </w:pPr>
@@ -388,9 +341,8 @@
         <w:rPr>
           <w:rFonts w:ascii="Times New Roman" w:hAnsi="Times New Roman"/>
           <w:b/>
-          <w:color w:val="000000"/>
-          <w:sz w:val="23"/>
-          <w:u w:val="none"/>
+          <w:position w:val="3"/>
+          <w:sz w:val="23"/>
         </w:rPr>
         <w:t>PLEASE TAKE NOTICE</w:t>
       </w:r>
@@ -398,26 +350,30 @@
         <w:rPr>
           <w:rFonts w:ascii="Times New Roman" w:hAnsi="Times New Roman"/>
           <w:b w:val="0"/>
-          <w:color w:val="000000"/>
-          <w:sz w:val="23"/>
-          <w:u w:val="none"/>
+          <w:position w:val="3"/>
+          <w:sz w:val="23"/>
         </w:rPr>
         <w:t xml:space="preserve"> that pursuant to the terms of tenancy for the above-referenced</w:t>
         <w:br/>
+      </w:r>
+      <w:r>
+        <w:rPr>
+          <w:rFonts w:ascii="Times New Roman" w:hAnsi="Times New Roman"/>
+          <w:b w:val="0"/>
+          <w:position w:val="6"/>
+          <w:sz w:val="23"/>
+        </w:rPr>
         <w:t>agreement by which you hold the possession of the Premises described in this Notice, there is</w:t>
         <w:br/>
+      </w:r>
+      <w:r>
+        <w:rPr>
+          <w:rFonts w:ascii="Times New Roman" w:hAnsi="Times New Roman"/>
+          <w:b w:val="0"/>
+          <w:position w:val="2"/>
+          <w:sz w:val="23"/>
+        </w:rPr>
         <w:t>now due, unpaid, and delinquent rent in the following amounts as specified below:</w:t>
-      </w:r>
-    </w:p>
-    <w:p>
-      <w:pPr>
-        <w:keepNext w:val="0"/>
-        <w:spacing w:before="0" w:after="0" w:line="192" w:lineRule="exact"/>
-      </w:pPr>
-      <w:r>
-        <w:rPr>
-          <w:sz w:val="1"/>
-        </w:rPr>
       </w:r>
     </w:p>
     <w:p>
@@ -428,7 +384,7 @@
         <w:tabs>
           <w:tab w:pos="6120" w:val="left"/>
         </w:tabs>
-        <w:spacing w:before="0" w:after="0" w:line="280" w:lineRule="exact"/>
+        <w:spacing w:before="192" w:after="0" w:line="290" w:lineRule="exact"/>
         <w:ind w:left="2520" w:right="2680" w:firstLine="0"/>
         <w:jc w:val="left"/>
       </w:pPr>
@@ -437,23 +393,30 @@
           <w:rFonts w:ascii="Times New Roman" w:hAnsi="Times New Roman"/>
           <w:b/>
           <w:color w:val="000000"/>
-          <w:sz w:val="24"/>
+          <w:position w:val="1"/>
+          <w:sz w:val="23"/>
           <w:u w:val="single"/>
         </w:rPr>
         <w:t>TIME PERIOD DUE</w:t>
+      </w:r>
+      <w:r>
+        <w:rPr>
+          <w:rFonts w:ascii="Times New Roman" w:hAnsi="Times New Roman"/>
+          <w:position w:val="1"/>
+          <w:sz w:val="23"/>
+          <w:u w:val="none"/>
+        </w:rPr>
         <w:tab/>
+      </w:r>
+      <w:r>
+        <w:rPr>
+          <w:rFonts w:ascii="Times New Roman" w:hAnsi="Times New Roman"/>
+          <w:b/>
+          <w:position w:val="1"/>
+          <w:sz w:val="23"/>
+          <w:u w:val="single"/>
+        </w:rPr>
         <w:t>AMOUNT DUE</w:t>
-      </w:r>
-    </w:p>
-    <w:p>
-      <w:pPr>
-        <w:keepNext w:val="0"/>
-        <w:spacing w:before="0" w:after="0" w:line="40" w:lineRule="exact"/>
-      </w:pPr>
-      <w:r>
-        <w:rPr>
-          <w:sz w:val="1"/>
-        </w:rPr>
       </w:r>
     </w:p>
     <w:p>
@@ -464,11 +427,11 @@
         <w:tabs>
           <w:tab w:pos="6120" w:val="left"/>
         </w:tabs>
-        <w:spacing w:before="0" w:after="0" w:line="280" w:lineRule="exact"/>
+        <w:spacing w:before="30" w:after="0" w:line="290" w:lineRule="exact"/>
         <w:ind w:left="2520" w:right="2680" w:firstLine="0"/>
         <w:jc w:val="left"/>
       </w:pPr>
-      <w:bookmarkStart w:id="19" w:name="BE_RENT_ROW_1"/>
+      <w:bookmarkStart w:id="11" w:name="BE_RENT_ROW_1"/>
       <w:r>
         <w:rPr>
           <w:rFonts w:ascii="Times New Roman" w:hAnsi="Times New Roman"/>
@@ -481,7 +444,7 @@
         <w:tab/>
         <w:t>{{AMOUNT_1}}</w:t>
       </w:r>
-      <w:bookmarkEnd w:id="19"/>
+      <w:bookmarkEnd w:id="11"/>
     </w:p>
     <w:p>
       <w:pPr>
@@ -491,11 +454,11 @@
         <w:tabs>
           <w:tab w:pos="6120" w:val="left"/>
         </w:tabs>
-        <w:spacing w:before="0" w:after="0" w:line="280" w:lineRule="exact"/>
+        <w:spacing w:before="0" w:after="0" w:line="290" w:lineRule="exact"/>
         <w:ind w:left="2520" w:right="2680" w:firstLine="0"/>
         <w:jc w:val="left"/>
       </w:pPr>
-      <w:bookmarkStart w:id="20" w:name="BE_RENT_ROW_2"/>
+      <w:bookmarkStart w:id="12" w:name="BE_RENT_ROW_2"/>
       <w:r>
         <w:rPr>
           <w:rFonts w:ascii="Times New Roman" w:hAnsi="Times New Roman"/>
@@ -508,7 +471,7 @@
         <w:tab/>
         <w:t>{{AMOUNT_2}}</w:t>
       </w:r>
-      <w:bookmarkEnd w:id="20"/>
+      <w:bookmarkEnd w:id="12"/>
     </w:p>
     <w:p>
       <w:pPr>
@@ -518,11 +481,11 @@
         <w:tabs>
           <w:tab w:pos="6120" w:val="left"/>
         </w:tabs>
-        <w:spacing w:before="0" w:after="0" w:line="280" w:lineRule="exact"/>
+        <w:spacing w:before="0" w:after="0" w:line="290" w:lineRule="exact"/>
         <w:ind w:left="2520" w:right="2680" w:firstLine="0"/>
         <w:jc w:val="left"/>
       </w:pPr>
-      <w:bookmarkStart w:id="21" w:name="BE_RENT_ROW_3"/>
+      <w:bookmarkStart w:id="13" w:name="BE_RENT_ROW_3"/>
       <w:r>
         <w:rPr>
           <w:rFonts w:ascii="Times New Roman" w:hAnsi="Times New Roman"/>
@@ -535,7 +498,7 @@
         <w:tab/>
         <w:t>{{AMOUNT_3}}</w:t>
       </w:r>
-      <w:bookmarkEnd w:id="21"/>
+      <w:bookmarkEnd w:id="13"/>
     </w:p>
     <w:p>
       <w:pPr>
@@ -545,11 +508,11 @@
         <w:tabs>
           <w:tab w:pos="6120" w:val="left"/>
         </w:tabs>
-        <w:spacing w:before="0" w:after="0" w:line="280" w:lineRule="exact"/>
+        <w:spacing w:before="0" w:after="0" w:line="290" w:lineRule="exact"/>
         <w:ind w:left="2520" w:right="2680" w:firstLine="0"/>
         <w:jc w:val="left"/>
       </w:pPr>
-      <w:bookmarkStart w:id="22" w:name="BE_RENT_ROW_4"/>
+      <w:bookmarkStart w:id="14" w:name="BE_RENT_ROW_4"/>
       <w:r>
         <w:rPr>
           <w:rFonts w:ascii="Times New Roman" w:hAnsi="Times New Roman"/>
@@ -562,7 +525,7 @@
         <w:tab/>
         <w:t>{{AMOUNT_4}}</w:t>
       </w:r>
-      <w:bookmarkEnd w:id="22"/>
+      <w:bookmarkEnd w:id="14"/>
     </w:p>
     <w:p>
       <w:pPr>
@@ -572,11 +535,11 @@
         <w:tabs>
           <w:tab w:pos="6120" w:val="left"/>
         </w:tabs>
-        <w:spacing w:before="0" w:after="0" w:line="280" w:lineRule="exact"/>
+        <w:spacing w:before="0" w:after="0" w:line="290" w:lineRule="exact"/>
         <w:ind w:left="2520" w:right="2680" w:firstLine="0"/>
         <w:jc w:val="left"/>
       </w:pPr>
-      <w:bookmarkStart w:id="23" w:name="BE_RENT_ROW_5"/>
+      <w:bookmarkStart w:id="15" w:name="BE_RENT_ROW_5"/>
       <w:r>
         <w:rPr>
           <w:rFonts w:ascii="Times New Roman" w:hAnsi="Times New Roman"/>
@@ -589,7 +552,7 @@
         <w:tab/>
         <w:t>{{AMOUNT_5}}</w:t>
       </w:r>
-      <w:bookmarkEnd w:id="23"/>
+      <w:bookmarkEnd w:id="15"/>
     </w:p>
     <w:p>
       <w:pPr>
@@ -599,11 +562,11 @@
         <w:tabs>
           <w:tab w:pos="6120" w:val="left"/>
         </w:tabs>
-        <w:spacing w:before="0" w:after="0" w:line="280" w:lineRule="exact"/>
+        <w:spacing w:before="0" w:after="0" w:line="290" w:lineRule="exact"/>
         <w:ind w:left="2520" w:right="2680" w:firstLine="0"/>
         <w:jc w:val="left"/>
       </w:pPr>
-      <w:bookmarkStart w:id="24" w:name="BE_RENT_ROW_6"/>
+      <w:bookmarkStart w:id="16" w:name="BE_RENT_ROW_6"/>
       <w:r>
         <w:rPr>
           <w:rFonts w:ascii="Times New Roman" w:hAnsi="Times New Roman"/>
@@ -616,25 +579,14 @@
         <w:tab/>
         <w:t>{{AMOUNT_6}}</w:t>
       </w:r>
-      <w:bookmarkEnd w:id="24"/>
-    </w:p>
-    <w:p>
-      <w:pPr>
-        <w:keepNext w:val="0"/>
-        <w:spacing w:before="0" w:after="0" w:line="60" w:lineRule="exact"/>
-      </w:pPr>
-      <w:r>
-        <w:rPr>
-          <w:sz w:val="1"/>
-        </w:rPr>
-      </w:r>
+      <w:bookmarkEnd w:id="16"/>
     </w:p>
     <w:tbl>
       <w:tblPr>
         <w:tblW w:type="auto" w:w="0"/>
+        <w:tblInd w:w="2540" w:type="dxa"/>
         <w:tblLayout w:type="fixed"/>
         <w:tblLook w:firstColumn="1" w:firstRow="1" w:lastColumn="0" w:lastRow="0" w:noHBand="0" w:noVBand="1" w:val="04A0"/>
-        <w:tblInd w:w="2540" w:type="dxa"/>
       </w:tblPr>
       <w:tblGrid>
         <w:gridCol w:w="3360"/>
@@ -647,18 +599,18 @@
         <w:tc>
           <w:tcPr>
             <w:tcW w:type="dxa" w:w="3360"/>
+            <w:tcBorders>
+              <w:top w:val="nil" w:sz="8" w:color="000000"/>
+              <w:bottom w:val="nil" w:sz="8" w:color="000000"/>
+              <w:left w:val="nil" w:sz="8" w:color="000000"/>
+              <w:right w:val="nil" w:sz="8" w:color="000000"/>
+            </w:tcBorders>
             <w:tcMar>
               <w:top w:w="0" w:type="dxa"/>
               <w:bottom w:w="0" w:type="dxa"/>
               <w:left w:w="40" w:type="dxa"/>
               <w:right w:w="40" w:type="dxa"/>
             </w:tcMar>
-            <w:tcBorders>
-              <w:top w:val="nil" w:sz="8" w:color="000000"/>
-              <w:bottom w:val="nil" w:sz="8" w:color="000000"/>
-              <w:left w:val="nil" w:sz="8" w:color="000000"/>
-              <w:right w:val="nil" w:sz="8" w:color="000000"/>
-            </w:tcBorders>
           </w:tcPr>
           <w:p>
             <w:pPr>
@@ -670,7 +622,8 @@
               <w:rPr>
                 <w:rFonts w:ascii="Times New Roman" w:hAnsi="Times New Roman"/>
                 <w:b/>
-                <w:sz w:val="24"/>
+                <w:position w:val="2"/>
+                <w:sz w:val="23"/>
               </w:rPr>
               <w:t>TOTAL AMOUNT DUE:</w:t>
             </w:r>
@@ -679,18 +632,18 @@
         <w:tc>
           <w:tcPr>
             <w:tcW w:type="dxa" w:w="2360"/>
+            <w:tcBorders>
+              <w:top w:val="single" w:sz="8" w:color="000000"/>
+              <w:bottom w:val="single" w:sz="8" w:color="000000"/>
+              <w:left w:val="single" w:sz="8" w:color="000000"/>
+              <w:right w:val="single" w:sz="8" w:color="000000"/>
+            </w:tcBorders>
             <w:tcMar>
               <w:top w:w="0" w:type="dxa"/>
               <w:bottom w:w="0" w:type="dxa"/>
               <w:left w:w="140" w:type="dxa"/>
               <w:right w:w="140" w:type="dxa"/>
             </w:tcMar>
-            <w:tcBorders>
-              <w:top w:val="single" w:sz="8" w:color="000000"/>
-              <w:bottom w:val="single" w:sz="8" w:color="000000"/>
-              <w:left w:val="single" w:sz="8" w:color="000000"/>
-              <w:right w:val="single" w:sz="8" w:color="000000"/>
-            </w:tcBorders>
           </w:tcPr>
           <w:p>
             <w:pPr>
@@ -701,7 +654,8 @@
             <w:r>
               <w:rPr>
                 <w:rFonts w:ascii="Times New Roman" w:hAnsi="Times New Roman"/>
-                <w:b w:val="0"/>
+                <w:b/>
+                <w:position w:val="2"/>
                 <w:sz w:val="24"/>
               </w:rPr>
               <w:t>{{TOTAL_AMOUNT}}</w:t>
@@ -713,13 +667,187 @@
     <w:p>
       <w:pPr>
         <w:keepNext w:val="0"/>
-        <w:spacing w:before="0" w:after="0" w:line="180" w:lineRule="exact"/>
-      </w:pPr>
-      <w:r>
-        <w:rPr>
-          <w:sz w:val="1"/>
-        </w:rPr>
-      </w:r>
+        <w:keepLines/>
+        <w:widowControl w:val="0"/>
+        <w:spacing w:before="180" w:after="0" w:line="275" w:lineRule="exact"/>
+        <w:ind w:left="394" w:right="766" w:firstLine="0"/>
+        <w:jc w:val="left"/>
+      </w:pPr>
+      <w:r>
+        <w:rPr>
+          <w:rFonts w:ascii="Times New Roman" w:hAnsi="Times New Roman"/>
+          <w:b w:val="0"/>
+          <w:color w:val="000000"/>
+          <w:position w:val="2"/>
+          <w:sz w:val="23"/>
+          <w:u w:val="none"/>
+        </w:rPr>
+        <w:t>You are further notified that within three (3) days after service of this notice on you, not including</w:t>
+        <w:br/>
+        <w:t>Saturdays, Sundays or other judicial holidays, you must pay the total amount of rent stated in this</w:t>
+        <w:br/>
+        <w:t>Notice in full or quit the Premises, meaning to deliver up possession of the Premises and vacate.</w:t>
+      </w:r>
+    </w:p>
+    <w:p>
+      <w:pPr>
+        <w:keepNext w:val="0"/>
+        <w:keepLines/>
+        <w:widowControl w:val="0"/>
+        <w:spacing w:before="235" w:after="0" w:line="275" w:lineRule="exact"/>
+        <w:ind w:left="394" w:right="766" w:firstLine="0"/>
+        <w:jc w:val="left"/>
+      </w:pPr>
+      <w:r>
+        <w:rPr>
+          <w:rFonts w:ascii="Times New Roman" w:hAnsi="Times New Roman"/>
+          <w:b/>
+          <w:color w:val="000000"/>
+          <w:position w:val="1"/>
+          <w:sz w:val="23"/>
+          <w:u w:val="none"/>
+        </w:rPr>
+        <w:t xml:space="preserve">This notice was served to you on _______________. You have three (3) </w:t>
+      </w:r>
+      <w:r>
+        <w:rPr>
+          <w:rFonts w:ascii="Times New Roman" w:hAnsi="Times New Roman"/>
+          <w:b/>
+          <w:position w:val="1"/>
+          <w:sz w:val="23"/>
+          <w:u w:val="single"/>
+        </w:rPr>
+        <w:t>days after</w:t>
+      </w:r>
+      <w:r>
+        <w:rPr>
+          <w:rFonts w:ascii="Times New Roman" w:hAnsi="Times New Roman"/>
+          <w:b/>
+          <w:position w:val="1"/>
+          <w:sz w:val="23"/>
+          <w:u w:val="none"/>
+        </w:rPr>
+        <w:t xml:space="preserve"> the date the</w:t>
+        <w:br/>
+        <w:t>notice was served to you, excluding Saturdays, Sundays, and other judicial holidays, to pay the</w:t>
+        <w:br/>
+        <w:t>rent due or vacate the property.</w:t>
+      </w:r>
+    </w:p>
+    <w:p>
+      <w:pPr>
+        <w:keepNext w:val="0"/>
+        <w:keepLines/>
+        <w:widowControl w:val="0"/>
+        <w:spacing w:before="205" w:after="0" w:line="275" w:lineRule="exact"/>
+        <w:ind w:left="394" w:right="766" w:firstLine="0"/>
+        <w:jc w:val="left"/>
+      </w:pPr>
+      <w:r>
+        <w:rPr>
+          <w:rFonts w:ascii="Times New Roman" w:hAnsi="Times New Roman"/>
+          <w:b w:val="0"/>
+          <w:color w:val="000000"/>
+          <w:position w:val="2"/>
+          <w:sz w:val="23"/>
+          <w:u w:val="none"/>
+        </w:rPr>
+        <w:t>Payment of the above total amount due should be tendered to, or possession of the premises</w:t>
+        <w:br/>
+        <w:t>delivered to:</w:t>
+      </w:r>
+    </w:p>
+    <w:p>
+      <w:pPr>
+        <w:keepNext w:val="0"/>
+        <w:keepLines/>
+        <w:widowControl w:val="0"/>
+        <w:spacing w:before="0" w:after="0" w:line="280" w:lineRule="exact"/>
+        <w:ind w:left="2060" w:right="340" w:firstLine="0"/>
+        <w:jc w:val="left"/>
+      </w:pPr>
+      <w:bookmarkStart w:id="20" w:name="BE_PAYMENT_RECIPIENT"/>
+      <w:r>
+        <w:rPr>
+          <w:rFonts w:ascii="Times New Roman" w:hAnsi="Times New Roman"/>
+          <w:b w:val="0"/>
+          <w:color w:val="000000"/>
+          <w:position w:val="7"/>
+          <w:sz w:val="24"/>
+          <w:u w:val="none"/>
+        </w:rPr>
+        <w:t>{{PAYMENT_RECIPIENT}}</w:t>
+      </w:r>
+      <w:bookmarkEnd w:id="20"/>
+    </w:p>
+    <w:p>
+      <w:pPr>
+        <w:keepNext w:val="0"/>
+        <w:keepLines/>
+        <w:widowControl w:val="0"/>
+        <w:spacing w:before="20" w:after="0" w:line="280" w:lineRule="exact"/>
+        <w:ind w:left="2100" w:right="300" w:firstLine="0"/>
+        <w:jc w:val="left"/>
+      </w:pPr>
+      <w:bookmarkStart w:id="21" w:name="BE_PAYMENT_STREET"/>
+      <w:r>
+        <w:rPr>
+          <w:rFonts w:ascii="Times New Roman" w:hAnsi="Times New Roman"/>
+          <w:b w:val="0"/>
+          <w:color w:val="000000"/>
+          <w:position w:val="4"/>
+          <w:sz w:val="24"/>
+          <w:u w:val="none"/>
+        </w:rPr>
+        <w:t>{{PAYMENT_STREET}}</w:t>
+      </w:r>
+      <w:bookmarkEnd w:id="21"/>
+    </w:p>
+    <w:p>
+      <w:pPr>
+        <w:keepNext w:val="0"/>
+        <w:keepLines/>
+        <w:widowControl w:val="0"/>
+        <w:spacing w:before="0" w:after="0" w:line="280" w:lineRule="exact"/>
+        <w:ind w:left="2100" w:right="300" w:firstLine="0"/>
+        <w:jc w:val="left"/>
+      </w:pPr>
+      <w:bookmarkStart w:id="22" w:name="BE_PAYMENT_CITY"/>
+      <w:r>
+        <w:rPr>
+          <w:rFonts w:ascii="Times New Roman" w:hAnsi="Times New Roman"/>
+          <w:b w:val="0"/>
+          <w:color w:val="000000"/>
+          <w:position w:val="2"/>
+          <w:sz w:val="24"/>
+          <w:u w:val="none"/>
+        </w:rPr>
+        <w:t>{{PAYMENT_CITY}}</w:t>
+      </w:r>
+      <w:bookmarkEnd w:id="22"/>
+    </w:p>
+    <w:p>
+      <w:pPr>
+        <w:keepNext w:val="0"/>
+        <w:keepLines/>
+        <w:widowControl w:val="0"/>
+        <w:spacing w:before="40" w:after="0" w:line="280" w:lineRule="exact"/>
+        <w:ind w:left="2120" w:right="380" w:firstLine="0"/>
+        <w:jc w:val="left"/>
+      </w:pPr>
+      <w:bookmarkStart w:id="23" w:name="BE_PAYMENT_PHONE"/>
+      <w:r>
+        <w:rPr>
+          <w:rFonts w:ascii="Times New Roman" w:hAnsi="Times New Roman"/>
+          <w:b w:val="0"/>
+          <w:color w:val="000000"/>
+          <w:position w:val="3"/>
+          <w:sz w:val="24"/>
+          <w:u w:val="none"/>
+        </w:rPr>
+        <w:t>{{PAYMENT_PHONE}}</w:t>
+      </w:r>
+      <w:bookmarkEnd w:id="23"/>
     </w:p>
     <w:p>
       <w:pPr>
@@ -735,302 +863,206 @@
           <w:rFonts w:ascii="Times New Roman" w:hAnsi="Times New Roman"/>
           <w:b w:val="0"/>
           <w:color w:val="000000"/>
-          <w:sz w:val="23"/>
-          <w:u w:val="none"/>
-        </w:rPr>
-        <w:t>You are further notified that within three (3) days after service of this notice on you, not including</w:t>
-        <w:br/>
-        <w:t>Saturdays, Sundays or other judicial holidays, you must pay the total amount of rent stated in this</w:t>
-        <w:br/>
-        <w:t>Notice in full or quit the Premises, meaning to deliver up possession of the Premises and vacate.</w:t>
-      </w:r>
-    </w:p>
-    <w:p>
-      <w:pPr>
-        <w:keepNext w:val="0"/>
-        <w:spacing w:before="0" w:after="0" w:line="235" w:lineRule="exact"/>
-      </w:pPr>
-      <w:r>
-        <w:rPr>
-          <w:sz w:val="1"/>
-        </w:rPr>
-      </w:r>
-    </w:p>
-    <w:p>
-      <w:pPr>
-        <w:keepNext w:val="0"/>
-        <w:keepLines/>
-        <w:widowControl w:val="0"/>
-        <w:spacing w:before="0" w:after="0" w:line="275" w:lineRule="exact"/>
+          <w:position w:val="4"/>
+          <w:sz w:val="23"/>
+          <w:u w:val="none"/>
+        </w:rPr>
+        <w:t>Rent or possession of the Premises may be tendered between normal business hours of 9:00AM to</w:t>
+        <w:br/>
+        <w:t>5:00PM, Monday through Friday.</w:t>
+      </w:r>
+    </w:p>
+    <w:p>
+      <w:pPr>
+        <w:keepNext w:val="0"/>
+        <w:keepLines/>
+        <w:widowControl w:val="0"/>
+        <w:spacing w:before="260" w:after="0" w:line="275" w:lineRule="exact"/>
         <w:ind w:left="394" w:right="766" w:firstLine="0"/>
         <w:jc w:val="left"/>
       </w:pPr>
       <w:r>
         <w:rPr>
           <w:rFonts w:ascii="Times New Roman" w:hAnsi="Times New Roman"/>
+          <w:b w:val="0"/>
+          <w:color w:val="000000"/>
+          <w:position w:val="3"/>
+          <w:sz w:val="23"/>
+          <w:u w:val="none"/>
+        </w:rPr>
+        <w:t>Only the total amount due and made prior to the expiration of this Notice may be made using cash or</w:t>
+        <w:br/>
+        <w:t>certified funds (e.g., cashier's check, money order, etc.). No other forms of payment are acceptable.</w:t>
+        <w:br/>
+        <w:t>Landlords, and the attorney on behalf of the Landlords, will not accept any payments after the</w:t>
+        <w:br/>
+        <w:t>expiration of this Notice. Further, be advised that Landlords will not accept any partial payments for the</w:t>
+        <w:br/>
+        <w:t>amounts outlined in this notice nor will they accept payments made to others ostensibly on their behalf:</w:t>
+        <w:br/>
+      </w:r>
+      <w:r>
+        <w:rPr>
+          <w:rFonts w:ascii="Times New Roman" w:hAnsi="Times New Roman"/>
+          <w:position w:val="3"/>
+          <w:sz w:val="23"/>
+          <w:u w:val="single"/>
+        </w:rPr>
+        <w:t>all payments must be made to the above-stated address.</w:t>
+      </w:r>
+    </w:p>
+    <w:p>
+      <w:pPr>
+        <w:pageBreakBefore/>
+        <w:spacing w:line="1960" w:lineRule="exact" w:before="0" w:after="0"/>
+      </w:pPr>
+      <w:r>
+        <w:rPr>
           <w:b/>
-          <w:color w:val="000000"/>
-          <w:sz w:val="23"/>
-          <w:u w:val="none"/>
-        </w:rPr>
-        <w:t xml:space="preserve">This notice was served to you on _______________. You have three (3) </w:t>
-      </w:r>
-      <w:r>
-        <w:rPr>
-          <w:rFonts w:ascii="Times New Roman" w:hAnsi="Times New Roman"/>
-          <w:b/>
-          <w:sz w:val="23"/>
-          <w:u w:val="single"/>
-        </w:rPr>
-        <w:t>days after</w:t>
-      </w:r>
-      <w:r>
-        <w:rPr>
-          <w:rFonts w:ascii="Times New Roman" w:hAnsi="Times New Roman"/>
-          <w:b/>
-          <w:sz w:val="23"/>
-          <w:u w:val="none"/>
-        </w:rPr>
-        <w:t xml:space="preserve"> the date the</w:t>
-        <w:br/>
-        <w:t>notice was served to you, excluding Saturdays, Sundays, and other judicial holidays, to pay the</w:t>
-        <w:br/>
-        <w:t>rent due or vacate the property.</w:t>
-      </w:r>
-    </w:p>
-    <w:p>
-      <w:pPr>
-        <w:keepNext w:val="0"/>
-        <w:spacing w:before="0" w:after="0" w:line="205" w:lineRule="exact"/>
-      </w:pPr>
-      <w:r>
-        <w:rPr>
-          <w:sz w:val="1"/>
-        </w:rPr>
-      </w:r>
-    </w:p>
-    <w:p>
-      <w:pPr>
-        <w:keepNext w:val="0"/>
-        <w:keepLines/>
-        <w:widowControl w:val="0"/>
-        <w:spacing w:before="0" w:after="0" w:line="275" w:lineRule="exact"/>
-        <w:ind w:left="394" w:right="766" w:firstLine="0"/>
-        <w:jc w:val="left"/>
-      </w:pPr>
-      <w:r>
-        <w:rPr>
-          <w:rFonts w:ascii="Times New Roman" w:hAnsi="Times New Roman"/>
-          <w:b w:val="0"/>
-          <w:color w:val="000000"/>
-          <w:sz w:val="23"/>
-          <w:u w:val="none"/>
-        </w:rPr>
-        <w:t>Payment of the above total amount due should be tendered to, or possession of the premises</w:t>
-        <w:br/>
-        <w:t>delivered to:</w:t>
-      </w:r>
-    </w:p>
-    <w:p>
-      <w:pPr>
-        <w:keepNext w:val="0"/>
-        <w:keepLines/>
-        <w:widowControl w:val="0"/>
-        <w:spacing w:before="0" w:after="0" w:line="280" w:lineRule="exact"/>
-        <w:ind w:left="2060" w:right="340" w:firstLine="0"/>
-        <w:jc w:val="left"/>
-      </w:pPr>
-      <w:bookmarkStart w:id="32" w:name="BE_PAYMENT_RECIPIENT"/>
-      <w:r>
-        <w:rPr>
-          <w:rFonts w:ascii="Times New Roman" w:hAnsi="Times New Roman"/>
-          <w:b w:val="0"/>
-          <w:color w:val="000000"/>
-          <w:sz w:val="24"/>
-          <w:u w:val="none"/>
-        </w:rPr>
-        <w:t>{{PAYMENT_RECIPIENT}}</w:t>
-      </w:r>
-      <w:bookmarkEnd w:id="32"/>
-    </w:p>
-    <w:p>
-      <w:pPr>
-        <w:keepNext w:val="0"/>
-        <w:spacing w:before="0" w:after="0" w:line="20" w:lineRule="exact"/>
-      </w:pPr>
-      <w:r>
-        <w:rPr>
-          <w:sz w:val="1"/>
-        </w:rPr>
-      </w:r>
-    </w:p>
-    <w:p>
-      <w:pPr>
-        <w:keepNext w:val="0"/>
-        <w:keepLines/>
-        <w:widowControl w:val="0"/>
-        <w:spacing w:before="0" w:after="0" w:line="280" w:lineRule="exact"/>
-        <w:ind w:left="2100" w:right="300" w:firstLine="0"/>
-        <w:jc w:val="left"/>
-      </w:pPr>
-      <w:bookmarkStart w:id="34" w:name="BE_PAYMENT_STREET"/>
-      <w:r>
-        <w:rPr>
-          <w:rFonts w:ascii="Times New Roman" w:hAnsi="Times New Roman"/>
-          <w:b w:val="0"/>
-          <w:color w:val="000000"/>
-          <w:sz w:val="24"/>
-          <w:u w:val="none"/>
-        </w:rPr>
-        <w:t>{{PAYMENT_STREET}}</w:t>
-      </w:r>
-      <w:bookmarkEnd w:id="34"/>
-    </w:p>
-    <w:p>
-      <w:pPr>
-        <w:keepNext w:val="0"/>
-        <w:keepLines/>
-        <w:widowControl w:val="0"/>
-        <w:spacing w:before="0" w:after="0" w:line="280" w:lineRule="exact"/>
-        <w:ind w:left="2100" w:right="300" w:firstLine="0"/>
-        <w:jc w:val="left"/>
-      </w:pPr>
-      <w:bookmarkStart w:id="35" w:name="BE_PAYMENT_CITY"/>
-      <w:r>
-        <w:rPr>
-          <w:rFonts w:ascii="Times New Roman" w:hAnsi="Times New Roman"/>
-          <w:b w:val="0"/>
-          <w:color w:val="000000"/>
-          <w:sz w:val="24"/>
-          <w:u w:val="none"/>
-        </w:rPr>
-        <w:t>{{PAYMENT_CITY}}</w:t>
-      </w:r>
-      <w:bookmarkEnd w:id="35"/>
-    </w:p>
-    <w:p>
-      <w:pPr>
-        <w:keepNext w:val="0"/>
-        <w:spacing w:before="0" w:after="0" w:line="40" w:lineRule="exact"/>
-      </w:pPr>
-      <w:r>
-        <w:rPr>
-          <w:sz w:val="1"/>
-        </w:rPr>
-      </w:r>
-    </w:p>
-    <w:p>
-      <w:pPr>
-        <w:keepNext w:val="0"/>
-        <w:keepLines/>
-        <w:widowControl w:val="0"/>
-        <w:spacing w:before="0" w:after="0" w:line="280" w:lineRule="exact"/>
-        <w:ind w:left="2120" w:right="380" w:firstLine="0"/>
-        <w:jc w:val="left"/>
-      </w:pPr>
-      <w:bookmarkStart w:id="37" w:name="BE_PAYMENT_PHONE"/>
-      <w:r>
-        <w:rPr>
-          <w:rFonts w:ascii="Times New Roman" w:hAnsi="Times New Roman"/>
-          <w:b w:val="0"/>
-          <w:color w:val="000000"/>
-          <w:sz w:val="24"/>
-          <w:u w:val="none"/>
-        </w:rPr>
-        <w:t>{{PAYMENT_PHONE}}</w:t>
-      </w:r>
-      <w:bookmarkEnd w:id="37"/>
-    </w:p>
-    <w:p>
-      <w:pPr>
-        <w:keepNext w:val="0"/>
-        <w:keepLines/>
-        <w:widowControl w:val="0"/>
-        <w:spacing w:before="0" w:after="0" w:line="275" w:lineRule="exact"/>
-        <w:ind w:left="394" w:right="766" w:firstLine="0"/>
-        <w:jc w:val="left"/>
-      </w:pPr>
-      <w:r>
-        <w:rPr>
-          <w:rFonts w:ascii="Times New Roman" w:hAnsi="Times New Roman"/>
-          <w:b w:val="0"/>
-          <w:color w:val="000000"/>
-          <w:sz w:val="23"/>
-          <w:u w:val="none"/>
-        </w:rPr>
-        <w:t>Rent or possession of the Premises may be tendered between normal business hours of 9:00AM to</w:t>
-        <w:br/>
-        <w:t>5:00PM, Monday through Friday.</w:t>
-      </w:r>
-    </w:p>
-    <w:p>
-      <w:pPr>
-        <w:keepNext w:val="0"/>
-        <w:spacing w:before="0" w:after="0" w:line="260" w:lineRule="exact"/>
-      </w:pPr>
-      <w:r>
-        <w:rPr>
-          <w:sz w:val="1"/>
-        </w:rPr>
-      </w:r>
-    </w:p>
-    <w:p>
-      <w:pPr>
-        <w:keepNext w:val="0"/>
-        <w:keepLines/>
-        <w:widowControl w:val="0"/>
-        <w:spacing w:before="0" w:after="0" w:line="275" w:lineRule="exact"/>
-        <w:ind w:left="394" w:right="766" w:firstLine="0"/>
-        <w:jc w:val="left"/>
-      </w:pPr>
-      <w:r>
-        <w:rPr>
-          <w:rFonts w:ascii="Times New Roman" w:hAnsi="Times New Roman"/>
-          <w:b w:val="0"/>
-          <w:color w:val="000000"/>
-          <w:sz w:val="23"/>
-          <w:u w:val="none"/>
-        </w:rPr>
-        <w:t>Only the total amount due and made prior to the expiration of this Notice may be made using cash or</w:t>
-        <w:br/>
-        <w:t>certified funds (e.g., cashier's check, money order, etc.). No other forms of payment are acceptable.</w:t>
-        <w:br/>
-        <w:t>Landlords, and the attorney on behalf of the Landlords, will not accept any payments after the</w:t>
-        <w:br/>
-        <w:t>expiration of this Notice. Further, be advised that Landlords will not accept any partial payments for the</w:t>
-        <w:br/>
-        <w:t>amounts outlined in this notice nor will they accept payments made to others ostensibly on their behalf:</w:t>
-        <w:br/>
-      </w:r>
-      <w:r>
-        <w:rPr>
-          <w:rFonts w:ascii="Times New Roman" w:hAnsi="Times New Roman"/>
-          <w:sz w:val="23"/>
-          <w:u w:val="single"/>
-        </w:rPr>
-        <w:t>all payments must be made to the above-stated address.</w:t>
-      </w:r>
-    </w:p>
-    <w:p>
-      <w:pPr>
-        <w:pageBreakBefore/>
-        <w:spacing w:line="1" w:lineRule="exact" w:before="0" w:after="0"/>
-      </w:pPr>
-      <w:r>
-        <w:rPr>
-          <w:sz w:val="1"/>
-        </w:rPr>
-      </w:r>
-    </w:p>
-    <w:p>
-      <w:pPr>
-        <w:keepNext w:val="0"/>
-        <w:spacing w:before="0" w:after="0" w:line="1959" w:lineRule="exact"/>
-      </w:pPr>
-      <w:r>
-        <w:rPr>
-          <w:sz w:val="1"/>
-        </w:rPr>
+          <w:noProof/>
+        </w:rPr>
+        <mc:AlternateContent>
+          <mc:Choice Requires="wpg">
+            <w:drawing>
+              <wp:anchor distT="0" distB="0" distL="0" distR="0" simplePos="0" relativeHeight="15728640" behindDoc="0" locked="0" layoutInCell="1" allowOverlap="1" wp14:anchorId="66BE6B9F" wp14:editId="66BE6BA0">
+                <wp:simplePos x="0" y="0"/>
+                <wp:positionH relativeFrom="page">
+                  <wp:posOffset>0</wp:posOffset>
+                </wp:positionH>
+                <wp:positionV relativeFrom="page">
+                  <wp:posOffset>0</wp:posOffset>
+                </wp:positionV>
+                <wp:extent cx="7772400" cy="1090295"/>
+                <wp:effectExtent l="0" t="0" r="0" b="0"/>
+                <wp:wrapNone/>
+                <wp:docPr id="3" name="Group 2"/>
+                <wp:cNvGraphicFramePr>
+                  <a:graphicFrameLocks xmlns:a="http://schemas.openxmlformats.org/drawingml/2006/main"/>
+                </wp:cNvGraphicFramePr>
+                <a:graphic xmlns:a="http://schemas.openxmlformats.org/drawingml/2006/main">
+                  <a:graphicData uri="http://schemas.microsoft.com/office/word/2010/wordprocessingGroup">
+                    <wpg:wgp>
+                      <wpg:cNvGrpSpPr>
+                        <a:grpSpLocks/>
+                      </wpg:cNvGrpSpPr>
+                      <wpg:grpSpPr>
+                        <a:xfrm>
+                          <a:off x="0" y="0"/>
+                          <a:ext cx="7772400" cy="1090295"/>
+                          <a:chOff x="0" y="0"/>
+                          <a:chExt cx="7772400" cy="1090295"/>
+                        </a:xfrm>
+                      </wpg:grpSpPr>
+                      <pic:pic xmlns:pic="http://schemas.openxmlformats.org/drawingml/2006/picture">
+                        <pic:nvPicPr>
+                          <pic:cNvPr id="3" name="Image 3"/>
+                          <pic:cNvPicPr/>
+                        </pic:nvPicPr>
+                        <pic:blipFill>
+                          <a:blip r:embed="rId11" cstate="print"/>
+                          <a:stretch>
+                            <a:fillRect/>
+                          </a:stretch>
+                        </pic:blipFill>
+                        <pic:spPr>
+                          <a:xfrm>
+                            <a:off x="0" y="0"/>
+                            <a:ext cx="7772400" cy="1090097"/>
+                          </a:xfrm>
+                          <a:prstGeom prst="rect">
+                            <a:avLst/>
+                          </a:prstGeom>
+                        </pic:spPr>
+                      </pic:pic>
+                    </wpg:wgp>
+                  </a:graphicData>
+                </a:graphic>
+              </wp:anchor>
+            </w:drawing>
+          </mc:Choice>
+          <mc:Fallback>
+            <w:pict>
+              <v:group w14:anchorId="66BE6B9F" id="Group 2" o:spid="_x0000_s1026" style="position:absolute;margin-left:0;margin-top:0;width:612pt;height:85.85pt;z-index:15728640;mso-wrap-distance-left:0;mso-wrap-distance-right:0;mso-position-horizontal-relative:page;mso-position-vertical-relative:page" coordsize="77724,10902" o:gfxdata="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">
+                <v:shapetype id="_x0000_t75" coordsize="21600,21600" o:spt="75" o:preferrelative="t" path="m@4@5l@4@11@9@11@9@5xe" filled="f" stroked="f">
+                  <v:stroke joinstyle="miter"/>
+                  <v:formulas>
+                    <v:f eqn="if lineDrawn pixelLineWidth 0"/>
+                    <v:f eqn="sum @0 1 0"/>
+                    <v:f eqn="sum 0 0 @1"/>
+                    <v:f eqn="prod @2 1 2"/>
+                    <v:f eqn="prod @3 21600 pixelWidth"/>
+                    <v:f eqn="prod @3 21600 pixelHeight"/>
+                    <v:f eqn="sum @0 0 1"/>
+                    <v:f eqn="prod @6 1 2"/>
+                    <v:f eqn="prod @7 21600 pixelWidth"/>
+                    <v:f eqn="sum @8 21600 0"/>
+                    <v:f eqn="prod @7 21600 pixelHeight"/>
+                    <v:f eqn="sum @10 21600 0"/>
+                  </v:formulas>
+                  <v:path o:extrusionok="f" gradientshapeok="t" o:connecttype="rect"/>
+                  <o:lock v:ext="edit" aspectratio="t"/>
+                </v:shapetype>
+                <v:shape id="Image 3" o:spid="_x0000_s1027" type="#_x0000_t75" style="position:absolute;width:77724;height:10900;visibility:visible;mso-wrap-style:square" o:gfxdata="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">
+                  <v:imagedata r:id="rId12" o:title=""/>
+                </v:shape>
+                <v:shapetype id="_x0000_t202" coordsize="21600,21600" o:spt="202" path="m,l,21600r21600,l21600,xe">
+                  <v:stroke joinstyle="miter"/>
+                  <v:path gradientshapeok="t" o:connecttype="rect"/>
+                </v:shapetype>
+                <w10:wrap anchorx="page" anchory="page"/>
+              </v:group>
+            </w:pict>
+          </mc:Fallback>
+        </mc:AlternateContent>
+      </w:r>
+      <w:r>
+        <w:rPr>
+          <w:noProof/>
+          <w:sz w:val="20"/>
+        </w:rPr>
+        <w:drawing>
+          <wp:anchor distT="0" distB="0" distL="0" distR="0" simplePos="0" relativeHeight="487528960" behindDoc="1" locked="0" layoutInCell="1" allowOverlap="1" wp14:anchorId="66BE6BA6" wp14:editId="66BE6BA7">
+            <wp:simplePos x="0" y="0"/>
+            <wp:positionH relativeFrom="page">
+              <wp:posOffset>636</wp:posOffset>
+            </wp:positionH>
+            <wp:positionV relativeFrom="page">
+              <wp:posOffset>9630703</wp:posOffset>
+            </wp:positionV>
+            <wp:extent cx="7771763" cy="427696"/>
+            <wp:effectExtent l="0" t="0" r="0" b="0"/>
+            <wp:wrapNone/>
+            <wp:docPr id="4" name="Image 1"/>
+            <wp:cNvGraphicFramePr>
+              <a:graphicFrameLocks xmlns:a="http://schemas.openxmlformats.org/drawingml/2006/main"/>
+            </wp:cNvGraphicFramePr>
+            <a:graphic xmlns:a="http://schemas.openxmlformats.org/drawingml/2006/main">
+              <a:graphicData uri="http://schemas.openxmlformats.org/drawingml/2006/picture">
+                <pic:pic xmlns:pic="http://schemas.openxmlformats.org/drawingml/2006/picture">
+                  <pic:nvPicPr>
+                    <pic:cNvPr id="1" name="Image 1"/>
+                    <pic:cNvPicPr/>
+                  </pic:nvPicPr>
+                  <pic:blipFill>
+                    <a:blip r:embed="rId15" cstate="print"/>
+                    <a:stretch>
+                      <a:fillRect/>
+                    </a:stretch>
+                  </pic:blipFill>
+                  <pic:spPr>
+                    <a:xfrm>
+                      <a:off x="0" y="0"/>
+                      <a:ext cx="7771763" cy="427696"/>
+                    </a:xfrm>
+                    <a:prstGeom prst="rect">
+                      <a:avLst/>
+                    </a:prstGeom>
+                  </pic:spPr>
+                </pic:pic>
+              </a:graphicData>
+            </a:graphic>
+          </wp:anchor>
+        </w:drawing>
       </w:r>
     </w:p>
     <w:p>
@@ -1058,20 +1090,9 @@
     <w:p>
       <w:pPr>
         <w:keepNext w:val="0"/>
-        <w:spacing w:before="0" w:after="0" w:line="300" w:lineRule="exact"/>
-      </w:pPr>
-      <w:r>
-        <w:rPr>
-          <w:sz w:val="1"/>
-        </w:rPr>
-      </w:r>
-    </w:p>
-    <w:p>
-      <w:pPr>
-        <w:keepNext w:val="0"/>
-        <w:keepLines/>
-        <w:widowControl w:val="0"/>
-        <w:spacing w:before="0" w:after="0" w:line="275" w:lineRule="exact"/>
+        <w:keepLines/>
+        <w:widowControl w:val="0"/>
+        <w:spacing w:before="300" w:after="0" w:line="275" w:lineRule="exact"/>
         <w:ind w:left="488" w:right="812" w:firstLine="0"/>
         <w:jc w:val="left"/>
       </w:pPr>
@@ -1089,20 +1110,9 @@
     <w:p>
       <w:pPr>
         <w:keepNext w:val="0"/>
-        <w:spacing w:before="0" w:after="0" w:line="255" w:lineRule="exact"/>
-      </w:pPr>
-      <w:r>
-        <w:rPr>
-          <w:sz w:val="1"/>
-        </w:rPr>
-      </w:r>
-    </w:p>
-    <w:p>
-      <w:pPr>
-        <w:keepNext w:val="0"/>
-        <w:keepLines/>
-        <w:widowControl w:val="0"/>
-        <w:spacing w:before="0" w:after="0" w:line="275" w:lineRule="exact"/>
+        <w:keepLines/>
+        <w:widowControl w:val="0"/>
+        <w:spacing w:before="255" w:after="0" w:line="275" w:lineRule="exact"/>
         <w:ind w:left="360" w:right="840" w:firstLine="0"/>
         <w:jc w:val="left"/>
       </w:pPr>
@@ -1136,20 +1146,9 @@
     <w:p>
       <w:pPr>
         <w:keepNext w:val="0"/>
-        <w:spacing w:before="0" w:after="0" w:line="280" w:lineRule="exact"/>
-      </w:pPr>
-      <w:r>
-        <w:rPr>
-          <w:sz w:val="1"/>
-        </w:rPr>
-      </w:r>
-    </w:p>
-    <w:p>
-      <w:pPr>
-        <w:keepNext w:val="0"/>
-        <w:keepLines/>
-        <w:widowControl w:val="0"/>
-        <w:spacing w:before="0" w:after="0" w:line="275" w:lineRule="exact"/>
+        <w:keepLines/>
+        <w:widowControl w:val="0"/>
+        <w:spacing w:before="280" w:after="0" w:line="275" w:lineRule="exact"/>
         <w:ind w:left="360" w:right="840" w:firstLine="0"/>
         <w:jc w:val="left"/>
       </w:pPr>
@@ -1189,20 +1188,9 @@
     <w:p>
       <w:pPr>
         <w:keepNext w:val="0"/>
-        <w:spacing w:before="0" w:after="0" w:line="275" w:lineRule="exact"/>
-      </w:pPr>
-      <w:r>
-        <w:rPr>
-          <w:sz w:val="1"/>
-        </w:rPr>
-      </w:r>
-    </w:p>
-    <w:p>
-      <w:pPr>
-        <w:keepNext w:val="0"/>
-        <w:keepLines/>
-        <w:widowControl w:val="0"/>
-        <w:spacing w:before="0" w:after="0" w:line="275" w:lineRule="exact"/>
+        <w:keepLines/>
+        <w:widowControl w:val="0"/>
+        <w:spacing w:before="275" w:after="0" w:line="275" w:lineRule="exact"/>
         <w:ind w:left="360" w:right="840" w:firstLine="0"/>
         <w:jc w:val="left"/>
       </w:pPr>
@@ -1224,20 +1212,9 @@
     <w:p>
       <w:pPr>
         <w:keepNext w:val="0"/>
-        <w:spacing w:before="0" w:after="0" w:line="275" w:lineRule="exact"/>
-      </w:pPr>
-      <w:r>
-        <w:rPr>
-          <w:sz w:val="1"/>
-        </w:rPr>
-      </w:r>
-    </w:p>
-    <w:p>
-      <w:pPr>
-        <w:keepNext w:val="0"/>
-        <w:keepLines/>
-        <w:widowControl w:val="0"/>
-        <w:spacing w:before="0" w:after="0" w:line="275" w:lineRule="exact"/>
+        <w:keepLines/>
+        <w:widowControl w:val="0"/>
+        <w:spacing w:before="275" w:after="0" w:line="275" w:lineRule="exact"/>
         <w:ind w:left="360" w:right="720" w:firstLine="0"/>
         <w:jc w:val="left"/>
       </w:pPr>
@@ -1259,95 +1236,56 @@
     <w:p>
       <w:pPr>
         <w:keepNext w:val="0"/>
-        <w:spacing w:before="0" w:after="0" w:line="845" w:lineRule="exact"/>
-      </w:pPr>
-      <w:r>
-        <w:rPr>
-          <w:sz w:val="1"/>
-        </w:rPr>
-      </w:r>
-    </w:p>
-    <w:p>
-      <w:pPr>
-        <w:keepNext w:val="0"/>
         <w:keepLines/>
         <w:widowControl w:val="0"/>
         <w:tabs>
-          <w:tab w:pos="3880" w:val="left"/>
+          <w:tab w:pos="3896" w:val="left"/>
         </w:tabs>
-        <w:spacing w:before="0" w:after="0" w:line="280" w:lineRule="exact"/>
-        <w:ind w:left="480" w:right="2620" w:firstLine="0"/>
-        <w:jc w:val="left"/>
-      </w:pPr>
-      <w:bookmarkStart w:id="55" w:name="BE_NOTICE_DATE"/>
-      <w:r>
-        <w:rPr>
-          <w:rFonts w:ascii="Times New Roman" w:hAnsi="Times New Roman"/>
-          <w:b w:val="0"/>
-          <w:color w:val="000000"/>
+        <w:spacing w:before="835" w:after="0" w:line="280" w:lineRule="exact"/>
+        <w:ind w:left="473" w:right="2611" w:firstLine="0"/>
+        <w:jc w:val="left"/>
+      </w:pPr>
+      <w:bookmarkStart w:id="33" w:name="BE_NOTICE_DATE"/>
+      <w:r>
+        <w:rPr>
+          <w:rFonts w:ascii="Times New Roman" w:hAnsi="Times New Roman"/>
+          <w:b w:val="0"/>
+          <w:color w:val="000000"/>
+          <w:sz w:val="23"/>
+          <w:u w:val="none"/>
+        </w:rPr>
+        <w:t xml:space="preserve">Date: </w:t>
+      </w:r>
+      <w:bookmarkEnd w:id="33"/>
+      <w:r>
+        <w:rPr>
+          <w:rFonts w:ascii="Times New Roman" w:hAnsi="Times New Roman"/>
           <w:sz w:val="24"/>
-          <w:u w:val="none"/>
-        </w:rPr>
-        <w:t>Date: {{NOTICE_DATE}}</w:t>
+        </w:rPr>
+        <w:t>{{NOTICE_DATE}}</w:t>
+      </w:r>
+      <w:r>
+        <w:rPr>
+          <w:rFonts w:ascii="Times New Roman" w:hAnsi="Times New Roman"/>
+          <w:sz w:val="23"/>
+        </w:rPr>
         <w:tab/>
         <w:t>(Original signed by agent/owner)</w:t>
       </w:r>
-      <w:bookmarkEnd w:id="55"/>
-    </w:p>
-    <w:p>
-      <w:pPr>
-        <w:keepNext w:val="0"/>
-        <w:spacing w:before="0" w:after="0" w:line="10" w:lineRule="exact"/>
-      </w:pPr>
-      <w:r>
-        <w:rPr>
-          <w:sz w:val="1"/>
-        </w:rPr>
-      </w:r>
-    </w:p>
-    <w:p>
-      <w:pPr>
-        <w:keepNext w:val="0"/>
-        <w:keepLines/>
-        <w:widowControl w:val="0"/>
-        <w:spacing w:before="0" w:after="0" w:line="10" w:lineRule="exact"/>
-        <w:ind w:left="2760" w:right="2620" w:firstLine="0"/>
-        <w:jc w:val="left"/>
+    </w:p>
+    <w:p>
+      <w:pPr>
+        <w:keepNext w:val="0"/>
+        <w:keepLines/>
+        <w:widowControl w:val="0"/>
         <w:pBdr>
-          <w:bottom w:val="single" w:sz="12" w:space="0" w:color="000000"/>
+          <w:top w:val="single" w:sz="14" w:space="5" w:color="000000"/>
         </w:pBdr>
-      </w:pPr>
-      <w:r>
-        <w:rPr>
-          <w:rFonts w:ascii="Times New Roman" w:hAnsi="Times New Roman"/>
-          <w:b w:val="0"/>
-          <w:color w:val="000000"/>
-          <w:sz w:val="2"/>
-          <w:u w:val="none"/>
-        </w:rPr>
-      </w:r>
-    </w:p>
-    <w:p>
-      <w:pPr>
-        <w:keepNext w:val="0"/>
-        <w:spacing w:before="0" w:after="0" w:line="130" w:lineRule="exact"/>
-      </w:pPr>
-      <w:r>
-        <w:rPr>
-          <w:sz w:val="1"/>
-        </w:rPr>
-      </w:r>
-    </w:p>
-    <w:p>
-      <w:pPr>
-        <w:keepNext w:val="0"/>
-        <w:keepLines/>
-        <w:widowControl w:val="0"/>
         <w:spacing w:before="0" w:after="0" w:line="280" w:lineRule="exact"/>
-        <w:ind w:left="2760" w:right="2620" w:firstLine="0"/>
+        <w:ind w:left="2788" w:right="2639" w:firstLine="0"/>
         <w:jc w:val="center"/>
       </w:pPr>
-      <w:bookmarkStart w:id="59" w:name="BE_SIGNER_NAME_AND_TITLE"/>
+      <w:bookmarkStart w:id="34" w:name="BE_SIGNER_NAME_AND_TITLE"/>
       <w:r>
         <w:rPr>
           <w:rFonts w:ascii="Times New Roman" w:hAnsi="Times New Roman"/>
@@ -1360,28 +1298,38 @@
         <w:br/>
         <w:t>{{SIGNER_CONTINUED}}</w:t>
       </w:r>
-      <w:bookmarkEnd w:id="59"/>
-    </w:p>
-    <w:p>
-      <w:pPr>
-        <w:keepNext w:val="0"/>
-        <w:spacing w:before="0" w:after="0" w:line="130" w:lineRule="exact"/>
-      </w:pPr>
-      <w:r>
-        <w:rPr>
-          <w:sz w:val="1"/>
-        </w:rPr>
-      </w:r>
-    </w:p>
-    <w:p>
-      <w:pPr>
-        <w:keepNext w:val="0"/>
-        <w:keepLines/>
-        <w:widowControl w:val="0"/>
-        <w:spacing w:before="0" w:after="0" w:line="280" w:lineRule="exact"/>
-        <w:ind w:left="3240" w:right="260" w:firstLine="0"/>
-        <w:jc w:val="left"/>
-      </w:pPr>
+      <w:bookmarkEnd w:id="34"/>
+    </w:p>
+    <w:p>
+      <w:pPr>
+        <w:keepNext w:val="0"/>
+        <w:keepLines/>
+        <w:widowControl w:val="0"/>
+        <w:spacing w:before="145" w:after="0" w:line="280" w:lineRule="exact"/>
+        <w:ind w:left="3248" w:right="252" w:firstLine="0"/>
+        <w:jc w:val="left"/>
+      </w:pPr>
+      <w:r>
+        <w:rPr>
+          <w:rFonts w:ascii="Times New Roman" w:hAnsi="Times New Roman"/>
+          <w:b w:val="0"/>
+          <w:color w:val="000000"/>
+          <w:sz w:val="23"/>
+          <w:u w:val="none"/>
+        </w:rPr>
+        <w:t>Housing Provider's Address:</w:t>
+      </w:r>
+    </w:p>
+    <w:p>
+      <w:pPr>
+        <w:keepNext w:val="0"/>
+        <w:keepLines/>
+        <w:widowControl w:val="0"/>
+        <w:spacing w:before="40" w:after="0" w:line="280" w:lineRule="exact"/>
+        <w:ind w:left="3300" w:right="0" w:firstLine="0"/>
+        <w:jc w:val="left"/>
+      </w:pPr>
+      <w:bookmarkStart w:id="36" w:name="BE_PROVIDER_STREET"/>
       <w:r>
         <w:rPr>
           <w:rFonts w:ascii="Times New Roman" w:hAnsi="Times New Roman"/>
@@ -1390,30 +1338,20 @@
           <w:sz w:val="24"/>
           <w:u w:val="none"/>
         </w:rPr>
-        <w:t>Housing Provider's Address:</w:t>
-      </w:r>
-    </w:p>
-    <w:p>
-      <w:pPr>
-        <w:keepNext w:val="0"/>
-        <w:spacing w:before="0" w:after="0" w:line="30" w:lineRule="exact"/>
-      </w:pPr>
-      <w:r>
-        <w:rPr>
-          <w:sz w:val="1"/>
-        </w:rPr>
-      </w:r>
-    </w:p>
-    <w:p>
-      <w:pPr>
-        <w:keepNext w:val="0"/>
-        <w:keepLines/>
-        <w:widowControl w:val="0"/>
-        <w:spacing w:before="0" w:after="0" w:line="280" w:lineRule="exact"/>
-        <w:ind w:left="3300" w:right="0" w:firstLine="0"/>
-        <w:jc w:val="left"/>
-      </w:pPr>
-      <w:bookmarkStart w:id="63" w:name="BE_PROVIDER_STREET"/>
+        <w:t>{{PROVIDER_STREET}}</w:t>
+      </w:r>
+      <w:bookmarkEnd w:id="36"/>
+    </w:p>
+    <w:p>
+      <w:pPr>
+        <w:keepNext w:val="0"/>
+        <w:keepLines/>
+        <w:widowControl w:val="0"/>
+        <w:spacing w:before="20" w:after="0" w:line="280" w:lineRule="exact"/>
+        <w:ind w:left="3260" w:right="40" w:firstLine="0"/>
+        <w:jc w:val="left"/>
+      </w:pPr>
+      <w:bookmarkStart w:id="37" w:name="BE_PROVIDER_CITY"/>
       <w:r>
         <w:rPr>
           <w:rFonts w:ascii="Times New Roman" w:hAnsi="Times New Roman"/>
@@ -1422,75 +1360,38 @@
           <w:sz w:val="24"/>
           <w:u w:val="none"/>
         </w:rPr>
-        <w:t>{{PROVIDER_STREET}}</w:t>
-      </w:r>
-      <w:bookmarkEnd w:id="63"/>
-    </w:p>
-    <w:p>
-      <w:pPr>
-        <w:keepNext w:val="0"/>
-        <w:spacing w:before="0" w:after="0" w:line="20" w:lineRule="exact"/>
-      </w:pPr>
-      <w:r>
-        <w:rPr>
-          <w:sz w:val="1"/>
-        </w:rPr>
-      </w:r>
-    </w:p>
-    <w:p>
-      <w:pPr>
-        <w:keepNext w:val="0"/>
-        <w:keepLines/>
-        <w:widowControl w:val="0"/>
-        <w:spacing w:before="0" w:after="0" w:line="280" w:lineRule="exact"/>
-        <w:ind w:left="3260" w:right="40" w:firstLine="0"/>
-        <w:jc w:val="left"/>
-      </w:pPr>
-      <w:bookmarkStart w:id="65" w:name="BE_PROVIDER_CITY"/>
-      <w:r>
-        <w:rPr>
-          <w:rFonts w:ascii="Times New Roman" w:hAnsi="Times New Roman"/>
-          <w:b w:val="0"/>
-          <w:color w:val="000000"/>
+        <w:t>{{PROVIDER_CITY}}</w:t>
+      </w:r>
+      <w:bookmarkEnd w:id="37"/>
+    </w:p>
+    <w:p>
+      <w:pPr>
+        <w:keepNext w:val="0"/>
+        <w:keepLines/>
+        <w:widowControl w:val="0"/>
+        <w:spacing w:before="10" w:after="0" w:line="280" w:lineRule="exact"/>
+        <w:ind w:left="3253" w:right="247" w:firstLine="0"/>
+        <w:jc w:val="left"/>
+      </w:pPr>
+      <w:bookmarkStart w:id="38" w:name="BE_PROVIDER_PHONE"/>
+      <w:r>
+        <w:rPr>
+          <w:rFonts w:ascii="Times New Roman" w:hAnsi="Times New Roman"/>
+          <w:b w:val="0"/>
+          <w:color w:val="000000"/>
+          <w:sz w:val="23"/>
+          <w:u w:val="none"/>
+        </w:rPr>
+        <w:t xml:space="preserve">Phone: </w:t>
+      </w:r>
+      <w:bookmarkEnd w:id="38"/>
+      <w:r>
+        <w:rPr>
+          <w:rFonts w:ascii="Times New Roman" w:hAnsi="Times New Roman"/>
           <w:sz w:val="24"/>
-          <w:u w:val="none"/>
-        </w:rPr>
-        <w:t>{{PROVIDER_CITY}}</w:t>
-      </w:r>
-      <w:bookmarkEnd w:id="65"/>
-    </w:p>
-    <w:p>
-      <w:pPr>
-        <w:keepNext w:val="0"/>
-        <w:spacing w:before="0" w:after="0" w:line="10" w:lineRule="exact"/>
-      </w:pPr>
-      <w:r>
-        <w:rPr>
-          <w:sz w:val="1"/>
-        </w:rPr>
-      </w:r>
-    </w:p>
-    <w:p>
-      <w:pPr>
-        <w:keepNext w:val="0"/>
-        <w:keepLines/>
-        <w:widowControl w:val="0"/>
-        <w:spacing w:before="0" w:after="0" w:line="280" w:lineRule="exact"/>
-        <w:ind w:left="3240" w:right="260" w:firstLine="0"/>
-        <w:jc w:val="left"/>
-      </w:pPr>
-      <w:bookmarkStart w:id="67" w:name="BE_PROVIDER_PHONE"/>
-      <w:r>
-        <w:rPr>
-          <w:rFonts w:ascii="Times New Roman" w:hAnsi="Times New Roman"/>
-          <w:b w:val="0"/>
-          <w:color w:val="000000"/>
-          <w:sz w:val="24"/>
-          <w:u w:val="none"/>
-        </w:rPr>
-        <w:t>Phone: {{PROVIDER_PHONE}}</w:t>
-      </w:r>
-      <w:bookmarkEnd w:id="67"/>
+        </w:rPr>
+        <w:t>{{PROVIDER_PHONE}}</w:t>
+      </w:r>
     </w:p>
     <w:sectPr>
       <w:pgSz w:w="12240" w:h="15840"/>

</xml_diff>